<commit_message>
feat: sync base resume template with latest Overleaf LaTeX source
</commit_message>
<xml_diff>
--- a/templates/base_resume.docx
+++ b/templates/base_resume.docx
@@ -421,7 +421,7 @@
         <w:ind w:left="144"/>
       </w:pPr>
       <w:r>
-        <w:t>Python Fullstack Developer Virtual Internship - Eduskills Foundation (Sep 2025) - Full Stack Web Development with AI tools - Edunet Foundation (Feb 2026) - Beyond the Basics: Mastering Advanced Digital Forensics Techniques - Belkasoft (Aug 2024) - SQL Certification - Technorbit Infosystems (Feb 2026)</w:t>
+        <w:t>Full Stack Web Development with AI tools - Edunet Foundation (Feb 2026) - SQL Certification - Technorbit Infosystems (Feb 2026) - AI Skills Passport - EY and Microsoft (Jan 2026) - Python Fullstack Developer Virtual Internship - Eduskills Foundation (Sep 2025)</w:t>
       </w:r>
     </w:p>
     <w:p>
@@ -442,7 +442,7 @@
         <w:ind w:left="144"/>
       </w:pPr>
       <w:r>
-        <w:t>SITES Committee Member - Society of Information Technology Engineering Students - Smart India Hackathon 2024 &amp; 2025 - Participant - CodeSpark 24-Hour Hackathon - Participant (Dept of IT, AVCOE)</w:t>
+        <w:t>SITES Committee Member - Society of Information Technology Engineering Students - Pitch Perfect Competition - E-Cell, Entrepreneurship Cell - Smart India Hackathon 2024 &amp; 2025 - Participant</w:t>
       </w:r>
     </w:p>
     <w:p>

</xml_diff>